<commit_message>
Documant that TSS_Delete is a no op if the context is NULL
Signed-off-by: Ken Goldman <kgoldman@us.ibm.com>
</commit_message>
<xml_diff>
--- a/ibmtss.docx
+++ b/ibmtss.docx
@@ -8144,15 +8144,7 @@
         </w:numPr>
       </w:pPr>
       <w:r>
-        <w:t xml:space="preserve">Session </w:t>
-      </w:r>
-      <w:proofErr w:type="gramStart"/>
-      <w:r>
-        <w:t>continue</w:t>
-      </w:r>
-      <w:proofErr w:type="gramEnd"/>
-      <w:r>
-        <w:t xml:space="preserve"> flag</w:t>
+        <w:t>Session continue flag</w:t>
       </w:r>
     </w:p>
     <w:p>
@@ -9043,6 +9035,29 @@
       <w:r>
         <w:t xml:space="preserve">.  </w:t>
       </w:r>
+      <w:ins w:id="19" w:author="Kenneth Goldman" w:date="2025-11-21T14:35:00Z">
+        <w:r>
+          <w:t xml:space="preserve">If </w:t>
+        </w:r>
+        <w:proofErr w:type="spellStart"/>
+        <w:r>
+          <w:t>tssContext</w:t>
+        </w:r>
+        <w:proofErr w:type="spellEnd"/>
+        <w:r>
+          <w:t xml:space="preserve"> is NULL</w:t>
+        </w:r>
+      </w:ins>
+      <w:ins w:id="20" w:author="Kenneth Goldman" w:date="2025-11-21T14:37:00Z">
+        <w:r>
+          <w:t xml:space="preserve">, </w:t>
+        </w:r>
+      </w:ins>
+      <w:ins w:id="21" w:author="Kenneth Goldman" w:date="2025-11-21T14:35:00Z">
+        <w:r>
+          <w:t xml:space="preserve"> no operation is performed.</w:t>
+        </w:r>
+      </w:ins>
     </w:p>
     <w:p/>
     <w:p>
@@ -9063,15 +9078,15 @@
       <w:pPr>
         <w:pStyle w:val="Heading2"/>
       </w:pPr>
-      <w:bookmarkStart w:id="19" w:name="_Ref532809551"/>
-      <w:bookmarkStart w:id="20" w:name="_Ref532809555"/>
-      <w:bookmarkStart w:id="21" w:name="_Toc35934223"/>
+      <w:bookmarkStart w:id="22" w:name="_Ref532809551"/>
+      <w:bookmarkStart w:id="23" w:name="_Ref532809555"/>
+      <w:bookmarkStart w:id="24" w:name="_Toc35934223"/>
       <w:r>
         <w:t>Optional Customization</w:t>
       </w:r>
-      <w:bookmarkEnd w:id="19"/>
-      <w:bookmarkEnd w:id="20"/>
-      <w:bookmarkEnd w:id="21"/>
+      <w:bookmarkEnd w:id="22"/>
+      <w:bookmarkEnd w:id="23"/>
+      <w:bookmarkEnd w:id="24"/>
     </w:p>
     <w:p/>
     <w:p>
@@ -9263,11 +9278,11 @@
       <w:pPr>
         <w:pStyle w:val="Heading3"/>
       </w:pPr>
-      <w:bookmarkStart w:id="22" w:name="_Toc35934224"/>
+      <w:bookmarkStart w:id="25" w:name="_Toc35934224"/>
       <w:r>
         <w:t>Property Example</w:t>
       </w:r>
-      <w:bookmarkEnd w:id="22"/>
+      <w:bookmarkEnd w:id="25"/>
     </w:p>
     <w:p/>
     <w:p>
@@ -9423,15 +9438,15 @@
       <w:pPr>
         <w:pStyle w:val="Heading3"/>
       </w:pPr>
-      <w:bookmarkStart w:id="23" w:name="_Ref469903677"/>
-      <w:bookmarkStart w:id="24" w:name="_Ref469903681"/>
-      <w:bookmarkStart w:id="25" w:name="_Toc35934225"/>
+      <w:bookmarkStart w:id="26" w:name="_Ref469903677"/>
+      <w:bookmarkStart w:id="27" w:name="_Ref469903681"/>
+      <w:bookmarkStart w:id="28" w:name="_Toc35934225"/>
       <w:r>
         <w:t>Properties</w:t>
       </w:r>
-      <w:bookmarkEnd w:id="23"/>
-      <w:bookmarkEnd w:id="24"/>
-      <w:bookmarkEnd w:id="25"/>
+      <w:bookmarkEnd w:id="26"/>
+      <w:bookmarkEnd w:id="27"/>
+      <w:bookmarkEnd w:id="28"/>
     </w:p>
     <w:p/>
     <w:p>
@@ -9464,12 +9479,12 @@
       <w:pPr>
         <w:pStyle w:val="Heading4"/>
       </w:pPr>
-      <w:bookmarkStart w:id="26" w:name="_Ref473273918"/>
+      <w:bookmarkStart w:id="29" w:name="_Ref473273918"/>
       <w:r>
         <w:lastRenderedPageBreak/>
         <w:t>TPM_TRACE_LEVEL</w:t>
       </w:r>
-      <w:bookmarkEnd w:id="26"/>
+      <w:bookmarkEnd w:id="29"/>
     </w:p>
     <w:p>
       <w:r>
@@ -9541,11 +9556,11 @@
       <w:pPr>
         <w:pStyle w:val="Heading4"/>
       </w:pPr>
-      <w:bookmarkStart w:id="27" w:name="_Ref473274005"/>
+      <w:bookmarkStart w:id="30" w:name="_Ref473274005"/>
       <w:r>
         <w:t>TPM_INTERFACE_TYPE</w:t>
       </w:r>
-      <w:bookmarkEnd w:id="27"/>
+      <w:bookmarkEnd w:id="30"/>
     </w:p>
     <w:p>
       <w:r>
@@ -9706,11 +9721,11 @@
       <w:pPr>
         <w:pStyle w:val="Heading4"/>
       </w:pPr>
-      <w:bookmarkStart w:id="28" w:name="_Ref473273410"/>
+      <w:bookmarkStart w:id="31" w:name="_Ref473273410"/>
       <w:r>
         <w:t>TPM_SERVER_NAME</w:t>
       </w:r>
-      <w:bookmarkEnd w:id="28"/>
+      <w:bookmarkEnd w:id="31"/>
     </w:p>
     <w:p>
       <w:r>
@@ -9737,11 +9752,11 @@
       <w:pPr>
         <w:pStyle w:val="Heading4"/>
       </w:pPr>
-      <w:bookmarkStart w:id="29" w:name="_Ref473273447"/>
+      <w:bookmarkStart w:id="32" w:name="_Ref473273447"/>
       <w:r>
         <w:t>TPM_SERVER_TYPE</w:t>
       </w:r>
-      <w:bookmarkEnd w:id="29"/>
+      <w:bookmarkEnd w:id="32"/>
     </w:p>
     <w:p>
       <w:r>
@@ -9826,11 +9841,11 @@
       <w:pPr>
         <w:pStyle w:val="Heading4"/>
       </w:pPr>
-      <w:bookmarkStart w:id="30" w:name="_Ref473273450"/>
+      <w:bookmarkStart w:id="33" w:name="_Ref473273450"/>
       <w:r>
         <w:t>TPM_COMMAND_PORT</w:t>
       </w:r>
-      <w:bookmarkEnd w:id="30"/>
+      <w:bookmarkEnd w:id="33"/>
     </w:p>
     <w:p>
       <w:r>
@@ -9858,11 +9873,11 @@
       <w:pPr>
         <w:pStyle w:val="Heading4"/>
       </w:pPr>
-      <w:bookmarkStart w:id="31" w:name="_Ref473273453"/>
+      <w:bookmarkStart w:id="34" w:name="_Ref473273453"/>
       <w:r>
         <w:t>TPM_PLATFORM_PORT</w:t>
       </w:r>
-      <w:bookmarkEnd w:id="31"/>
+      <w:bookmarkEnd w:id="34"/>
     </w:p>
     <w:p>
       <w:r>
@@ -9891,11 +9906,11 @@
       <w:pPr>
         <w:pStyle w:val="Heading4"/>
       </w:pPr>
-      <w:bookmarkStart w:id="32" w:name="_Ref473273499"/>
+      <w:bookmarkStart w:id="35" w:name="_Ref473273499"/>
       <w:r>
         <w:t>TPM_DEVICE</w:t>
       </w:r>
-      <w:bookmarkEnd w:id="32"/>
+      <w:bookmarkEnd w:id="35"/>
     </w:p>
     <w:p>
       <w:r>
@@ -10023,11 +10038,11 @@
       <w:pPr>
         <w:pStyle w:val="Heading4"/>
       </w:pPr>
-      <w:bookmarkStart w:id="33" w:name="_Ref473274288"/>
+      <w:bookmarkStart w:id="36" w:name="_Ref473274288"/>
       <w:r>
         <w:t>TPM_ENCRYPT_SESSIONS</w:t>
       </w:r>
-      <w:bookmarkEnd w:id="33"/>
+      <w:bookmarkEnd w:id="36"/>
     </w:p>
     <w:p>
       <w:r>
@@ -10239,8 +10254,8 @@
       <w:pPr>
         <w:pStyle w:val="Heading3"/>
       </w:pPr>
-      <w:bookmarkStart w:id="34" w:name="_Ref418692484"/>
-      <w:bookmarkStart w:id="35" w:name="_Toc35934226"/>
+      <w:bookmarkStart w:id="37" w:name="_Ref418692484"/>
+      <w:bookmarkStart w:id="38" w:name="_Toc35934226"/>
       <w:proofErr w:type="spellStart"/>
       <w:r>
         <w:t>TS</w:t>
@@ -10263,8 +10278,8 @@
       <w:r>
         <w:t>)</w:t>
       </w:r>
-      <w:bookmarkEnd w:id="34"/>
-      <w:bookmarkEnd w:id="35"/>
+      <w:bookmarkEnd w:id="37"/>
+      <w:bookmarkEnd w:id="38"/>
     </w:p>
     <w:p/>
     <w:p>
@@ -10513,11 +10528,11 @@
       <w:pPr>
         <w:pStyle w:val="Heading2"/>
       </w:pPr>
-      <w:bookmarkStart w:id="36" w:name="_Toc35934227"/>
+      <w:bookmarkStart w:id="39" w:name="_Toc35934227"/>
       <w:r>
         <w:t>Extra Parameter</w:t>
       </w:r>
-      <w:bookmarkEnd w:id="36"/>
+      <w:bookmarkEnd w:id="39"/>
     </w:p>
     <w:p/>
     <w:p>
@@ -10558,14 +10573,14 @@
       <w:pPr>
         <w:pStyle w:val="Heading2"/>
       </w:pPr>
-      <w:bookmarkStart w:id="37" w:name="_Toc35934228"/>
+      <w:bookmarkStart w:id="40" w:name="_Toc35934228"/>
       <w:r>
         <w:t>Other APIs</w:t>
       </w:r>
       <w:r>
         <w:t xml:space="preserve"> and Headers</w:t>
       </w:r>
-      <w:bookmarkEnd w:id="37"/>
+      <w:bookmarkEnd w:id="40"/>
     </w:p>
     <w:p/>
     <w:p>
@@ -10617,15 +10632,7 @@
     <w:p/>
     <w:p>
       <w:r>
-        <w:t xml:space="preserve">The utility / demo applications cheat a </w:t>
-      </w:r>
-      <w:proofErr w:type="gramStart"/>
-      <w:r>
-        <w:t>bit,</w:t>
-      </w:r>
-      <w:proofErr w:type="gramEnd"/>
-      <w:r>
-        <w:t xml:space="preserve"> in that they call into TSS utility functions.  These are less likely to be stable than the official API above.</w:t>
+        <w:t>The utility / demo applications cheat a bit, in that they call into TSS utility functions.  These are less likely to be stable than the official API above.</w:t>
       </w:r>
     </w:p>
     <w:p/>
@@ -10983,7 +10990,7 @@
           <w:sz w:val="22"/>
         </w:rPr>
       </w:pPr>
-      <w:bookmarkStart w:id="38" w:name="_Toc35934229"/>
+      <w:bookmarkStart w:id="41" w:name="_Toc35934229"/>
       <w:r>
         <w:rPr>
           <w:spacing w:val="8"/>
@@ -10992,7 +10999,7 @@
         <w:lastRenderedPageBreak/>
         <w:t>Application Notes</w:t>
       </w:r>
-      <w:bookmarkEnd w:id="38"/>
+      <w:bookmarkEnd w:id="41"/>
     </w:p>
     <w:p/>
     <w:p>
@@ -11005,11 +11012,11 @@
       <w:pPr>
         <w:pStyle w:val="Heading2"/>
       </w:pPr>
-      <w:bookmarkStart w:id="39" w:name="_Toc35934230"/>
+      <w:bookmarkStart w:id="42" w:name="_Toc35934230"/>
       <w:r>
         <w:t>TPM Simulator</w:t>
       </w:r>
-      <w:bookmarkEnd w:id="39"/>
+      <w:bookmarkEnd w:id="42"/>
     </w:p>
     <w:p/>
     <w:p>
@@ -11054,11 +11061,11 @@
       <w:pPr>
         <w:pStyle w:val="Heading2"/>
       </w:pPr>
-      <w:bookmarkStart w:id="40" w:name="_Toc35934231"/>
+      <w:bookmarkStart w:id="43" w:name="_Toc35934231"/>
       <w:r>
         <w:t>Parameter Encryption</w:t>
       </w:r>
-      <w:bookmarkEnd w:id="40"/>
+      <w:bookmarkEnd w:id="43"/>
     </w:p>
     <w:p/>
     <w:p>
@@ -11071,11 +11078,11 @@
       <w:pPr>
         <w:pStyle w:val="Heading2"/>
       </w:pPr>
-      <w:bookmarkStart w:id="41" w:name="_Toc35934232"/>
+      <w:bookmarkStart w:id="44" w:name="_Toc35934232"/>
       <w:r>
         <w:t>Session Salt</w:t>
       </w:r>
-      <w:bookmarkEnd w:id="41"/>
+      <w:bookmarkEnd w:id="44"/>
     </w:p>
     <w:p/>
     <w:p>
@@ -11157,24 +11164,16 @@
       <w:pPr>
         <w:pStyle w:val="Heading2"/>
       </w:pPr>
-      <w:bookmarkStart w:id="42" w:name="_Toc35934233"/>
+      <w:bookmarkStart w:id="45" w:name="_Toc35934233"/>
       <w:r>
         <w:t>Session Bind</w:t>
       </w:r>
-      <w:bookmarkEnd w:id="42"/>
-    </w:p>
-    <w:p/>
-    <w:p>
-      <w:r>
-        <w:t xml:space="preserve">To bind, the caller should set </w:t>
-      </w:r>
-      <w:proofErr w:type="gramStart"/>
-      <w:r>
-        <w:t>bind</w:t>
-      </w:r>
-      <w:proofErr w:type="gramEnd"/>
-      <w:r>
-        <w:t xml:space="preserve"> </w:t>
+      <w:bookmarkEnd w:id="45"/>
+    </w:p>
+    <w:p/>
+    <w:p>
+      <w:r>
+        <w:t xml:space="preserve">To bind, the caller should set bind </w:t>
       </w:r>
       <w:r>
         <w:t xml:space="preserve">(the bind entity handle) </w:t>
@@ -11213,12 +11212,12 @@
       <w:pPr>
         <w:pStyle w:val="Heading2"/>
       </w:pPr>
-      <w:bookmarkStart w:id="43" w:name="_Toc35934234"/>
+      <w:bookmarkStart w:id="46" w:name="_Toc35934234"/>
       <w:r>
         <w:lastRenderedPageBreak/>
         <w:t>NV</w:t>
       </w:r>
-      <w:bookmarkEnd w:id="43"/>
+      <w:bookmarkEnd w:id="46"/>
     </w:p>
     <w:p/>
     <w:p>
@@ -11272,11 +11271,11 @@
       <w:pPr>
         <w:pStyle w:val="Heading3"/>
       </w:pPr>
-      <w:bookmarkStart w:id="44" w:name="_Toc35934235"/>
+      <w:bookmarkStart w:id="47" w:name="_Toc35934235"/>
       <w:r>
         <w:t>Rationale</w:t>
       </w:r>
-      <w:bookmarkEnd w:id="44"/>
+      <w:bookmarkEnd w:id="47"/>
     </w:p>
     <w:p/>
     <w:p>
@@ -11377,7 +11376,7 @@
       <w:pPr>
         <w:pStyle w:val="Heading3"/>
       </w:pPr>
-      <w:bookmarkStart w:id="45" w:name="_Toc35934236"/>
+      <w:bookmarkStart w:id="48" w:name="_Toc35934236"/>
       <w:r>
         <w:t>NV Pre</w:t>
       </w:r>
@@ -11387,7 +11386,7 @@
       <w:r>
         <w:t>provisioning</w:t>
       </w:r>
-      <w:bookmarkEnd w:id="45"/>
+      <w:bookmarkEnd w:id="48"/>
     </w:p>
     <w:p/>
     <w:p>
@@ -11479,11 +11478,11 @@
       <w:pPr>
         <w:pStyle w:val="Heading2"/>
       </w:pPr>
-      <w:bookmarkStart w:id="46" w:name="_Toc35934237"/>
+      <w:bookmarkStart w:id="49" w:name="_Toc35934237"/>
       <w:r>
         <w:t>TPM2_LoadExternal</w:t>
       </w:r>
-      <w:bookmarkEnd w:id="46"/>
+      <w:bookmarkEnd w:id="49"/>
     </w:p>
     <w:p/>
     <w:p>
@@ -11549,17 +11548,17 @@
       <w:pPr>
         <w:pStyle w:val="Heading2"/>
       </w:pPr>
-      <w:bookmarkStart w:id="47" w:name="_Toc467152813"/>
-      <w:bookmarkStart w:id="48" w:name="_Ref483554619"/>
-      <w:bookmarkStart w:id="49" w:name="_Ref483554623"/>
-      <w:bookmarkStart w:id="50" w:name="_Toc35934238"/>
-      <w:bookmarkEnd w:id="47"/>
+      <w:bookmarkStart w:id="50" w:name="_Toc467152813"/>
+      <w:bookmarkStart w:id="51" w:name="_Ref483554619"/>
+      <w:bookmarkStart w:id="52" w:name="_Ref483554623"/>
+      <w:bookmarkStart w:id="53" w:name="_Toc35934238"/>
+      <w:bookmarkEnd w:id="50"/>
       <w:r>
         <w:t>Connecting to Resource Managers</w:t>
       </w:r>
-      <w:bookmarkEnd w:id="48"/>
-      <w:bookmarkEnd w:id="49"/>
-      <w:bookmarkEnd w:id="50"/>
+      <w:bookmarkEnd w:id="51"/>
+      <w:bookmarkEnd w:id="52"/>
+      <w:bookmarkEnd w:id="53"/>
     </w:p>
     <w:p/>
     <w:p>
@@ -11755,7 +11754,7 @@
       <w:pPr>
         <w:pStyle w:val="Heading2"/>
       </w:pPr>
-      <w:bookmarkStart w:id="51" w:name="_Toc35934239"/>
+      <w:bookmarkStart w:id="54" w:name="_Toc35934239"/>
       <w:r>
         <w:t>Endorsement Key (EK</w:t>
       </w:r>
@@ -11765,7 +11764,7 @@
       <w:r>
         <w:t xml:space="preserve"> Certificates</w:t>
       </w:r>
-      <w:bookmarkEnd w:id="51"/>
+      <w:bookmarkEnd w:id="54"/>
     </w:p>
     <w:p/>
     <w:p>
@@ -11882,11 +11881,11 @@
       <w:pPr>
         <w:pStyle w:val="Heading3"/>
       </w:pPr>
-      <w:bookmarkStart w:id="52" w:name="_Toc35934240"/>
+      <w:bookmarkStart w:id="55" w:name="_Toc35934240"/>
       <w:r>
         <w:t>Nuvoton</w:t>
       </w:r>
-      <w:bookmarkEnd w:id="52"/>
+      <w:bookmarkEnd w:id="55"/>
     </w:p>
     <w:p/>
     <w:p>
@@ -12004,11 +12003,11 @@
       <w:pPr>
         <w:pStyle w:val="Heading3"/>
       </w:pPr>
-      <w:bookmarkStart w:id="53" w:name="_Toc35934241"/>
+      <w:bookmarkStart w:id="56" w:name="_Toc35934241"/>
       <w:r>
         <w:t>St Micro</w:t>
       </w:r>
-      <w:bookmarkEnd w:id="53"/>
+      <w:bookmarkEnd w:id="56"/>
     </w:p>
     <w:p/>
     <w:p>
@@ -12251,11 +12250,11 @@
       <w:pPr>
         <w:pStyle w:val="Heading3"/>
       </w:pPr>
-      <w:bookmarkStart w:id="54" w:name="_Toc35934242"/>
+      <w:bookmarkStart w:id="57" w:name="_Toc35934242"/>
       <w:r>
         <w:t>Infineon</w:t>
       </w:r>
-      <w:bookmarkEnd w:id="54"/>
+      <w:bookmarkEnd w:id="57"/>
     </w:p>
     <w:p/>
     <w:p>
@@ -12274,12 +12273,12 @@
       <w:pPr>
         <w:pStyle w:val="Heading3"/>
       </w:pPr>
-      <w:bookmarkStart w:id="55" w:name="_Toc35934243"/>
+      <w:bookmarkStart w:id="58" w:name="_Toc35934243"/>
       <w:proofErr w:type="spellStart"/>
       <w:r>
         <w:t>NationZ</w:t>
       </w:r>
-      <w:bookmarkEnd w:id="55"/>
+      <w:bookmarkEnd w:id="58"/>
       <w:proofErr w:type="spellEnd"/>
     </w:p>
     <w:p/>
@@ -12366,11 +12365,11 @@
       <w:pPr>
         <w:pStyle w:val="Heading3"/>
       </w:pPr>
-      <w:bookmarkStart w:id="56" w:name="_Toc35934244"/>
+      <w:bookmarkStart w:id="59" w:name="_Toc35934244"/>
       <w:r>
         <w:t>Intel</w:t>
       </w:r>
-      <w:bookmarkEnd w:id="56"/>
+      <w:bookmarkEnd w:id="59"/>
     </w:p>
     <w:p/>
     <w:p>
@@ -12429,11 +12428,11 @@
           <w:numId w:val="2"/>
         </w:numPr>
       </w:pPr>
-      <w:bookmarkStart w:id="57" w:name="_Toc35934245"/>
+      <w:bookmarkStart w:id="60" w:name="_Toc35934245"/>
       <w:r>
         <w:t>Intel EK Certificate Download</w:t>
       </w:r>
-      <w:bookmarkEnd w:id="57"/>
+      <w:bookmarkEnd w:id="60"/>
     </w:p>
     <w:p/>
     <w:p>
@@ -12653,13 +12652,13 @@
       <w:pPr>
         <w:pStyle w:val="Heading2"/>
       </w:pPr>
-      <w:bookmarkStart w:id="58" w:name="_Ref469903483"/>
-      <w:bookmarkStart w:id="59" w:name="_Toc35934246"/>
+      <w:bookmarkStart w:id="61" w:name="_Ref469903483"/>
+      <w:bookmarkStart w:id="62" w:name="_Toc35934246"/>
       <w:r>
         <w:t>Command Line Utilities</w:t>
       </w:r>
-      <w:bookmarkEnd w:id="58"/>
-      <w:bookmarkEnd w:id="59"/>
+      <w:bookmarkEnd w:id="61"/>
+      <w:bookmarkEnd w:id="62"/>
     </w:p>
     <w:p/>
     <w:p>
@@ -12992,36 +12991,28 @@
       <w:pPr>
         <w:pStyle w:val="Heading2"/>
       </w:pPr>
-      <w:bookmarkStart w:id="60" w:name="_Toc3554812"/>
-      <w:bookmarkStart w:id="61" w:name="_Toc6495716"/>
-      <w:bookmarkStart w:id="62" w:name="_Toc3554813"/>
-      <w:bookmarkStart w:id="63" w:name="_Toc6495717"/>
-      <w:bookmarkStart w:id="64" w:name="_Ref514762246"/>
-      <w:bookmarkStart w:id="65" w:name="_Ref514762249"/>
-      <w:bookmarkStart w:id="66" w:name="_Toc35934247"/>
-      <w:bookmarkEnd w:id="60"/>
-      <w:bookmarkEnd w:id="61"/>
-      <w:bookmarkEnd w:id="62"/>
+      <w:bookmarkStart w:id="63" w:name="_Toc3554812"/>
+      <w:bookmarkStart w:id="64" w:name="_Toc6495716"/>
+      <w:bookmarkStart w:id="65" w:name="_Toc3554813"/>
+      <w:bookmarkStart w:id="66" w:name="_Toc6495717"/>
+      <w:bookmarkStart w:id="67" w:name="_Ref514762246"/>
+      <w:bookmarkStart w:id="68" w:name="_Ref514762249"/>
+      <w:bookmarkStart w:id="69" w:name="_Toc35934247"/>
       <w:bookmarkEnd w:id="63"/>
-      <w:r>
-        <w:t>TSS for TPM 1.2</w:t>
-      </w:r>
       <w:bookmarkEnd w:id="64"/>
       <w:bookmarkEnd w:id="65"/>
       <w:bookmarkEnd w:id="66"/>
-    </w:p>
-    <w:p/>
-    <w:p>
-      <w:r>
-        <w:t xml:space="preserve">This is </w:t>
-      </w:r>
-      <w:proofErr w:type="gramStart"/>
-      <w:r>
-        <w:t>new</w:t>
-      </w:r>
-      <w:proofErr w:type="gramEnd"/>
-      <w:r>
-        <w:t xml:space="preserve"> code </w:t>
+      <w:r>
+        <w:t>TSS for TPM 1.2</w:t>
+      </w:r>
+      <w:bookmarkEnd w:id="67"/>
+      <w:bookmarkEnd w:id="68"/>
+      <w:bookmarkEnd w:id="69"/>
+    </w:p>
+    <w:p/>
+    <w:p>
+      <w:r>
+        <w:t xml:space="preserve">This is new code </w:t>
       </w:r>
       <w:proofErr w:type="gramStart"/>
       <w:r>
@@ -13265,7 +13256,7 @@
           <w:sz w:val="22"/>
         </w:rPr>
       </w:pPr>
-      <w:bookmarkStart w:id="67" w:name="_Toc35934248"/>
+      <w:bookmarkStart w:id="70" w:name="_Toc35934248"/>
       <w:r>
         <w:rPr>
           <w:spacing w:val="8"/>
@@ -13281,7 +13272,7 @@
         </w:rPr>
         <w:t>s</w:t>
       </w:r>
-      <w:bookmarkEnd w:id="67"/>
+      <w:bookmarkEnd w:id="70"/>
     </w:p>
     <w:p>
       <w:r>
@@ -13299,12 +13290,12 @@
       <w:pPr>
         <w:pStyle w:val="Heading2"/>
       </w:pPr>
-      <w:bookmarkStart w:id="68" w:name="_Toc35934249"/>
+      <w:bookmarkStart w:id="71" w:name="_Toc35934249"/>
       <w:proofErr w:type="spellStart"/>
       <w:r>
         <w:t>signapp.c</w:t>
       </w:r>
-      <w:bookmarkEnd w:id="68"/>
+      <w:bookmarkEnd w:id="71"/>
       <w:proofErr w:type="spellEnd"/>
     </w:p>
     <w:p/>
@@ -13591,12 +13582,12 @@
       <w:pPr>
         <w:pStyle w:val="Heading2"/>
       </w:pPr>
-      <w:bookmarkStart w:id="69" w:name="_Toc35934250"/>
+      <w:bookmarkStart w:id="72" w:name="_Toc35934250"/>
       <w:proofErr w:type="spellStart"/>
       <w:r>
         <w:t>writeapp.c</w:t>
       </w:r>
-      <w:bookmarkEnd w:id="69"/>
+      <w:bookmarkEnd w:id="72"/>
       <w:proofErr w:type="spellEnd"/>
     </w:p>
     <w:p/>
@@ -13760,7 +13751,7 @@
           <w:sz w:val="22"/>
         </w:rPr>
       </w:pPr>
-      <w:bookmarkStart w:id="70" w:name="_Toc35934251"/>
+      <w:bookmarkStart w:id="73" w:name="_Toc35934251"/>
       <w:r>
         <w:rPr>
           <w:spacing w:val="8"/>
@@ -13769,7 +13760,7 @@
         <w:lastRenderedPageBreak/>
         <w:t>Utility tools</w:t>
       </w:r>
-      <w:bookmarkEnd w:id="70"/>
+      <w:bookmarkEnd w:id="73"/>
     </w:p>
     <w:p>
       <w:r>
@@ -13796,23 +13787,23 @@
       <w:pPr>
         <w:pStyle w:val="Heading2"/>
       </w:pPr>
-      <w:bookmarkStart w:id="71" w:name="_Toc35934252"/>
+      <w:bookmarkStart w:id="74" w:name="_Toc35934252"/>
       <w:r>
         <w:t>Debugging Aids</w:t>
       </w:r>
-      <w:bookmarkEnd w:id="71"/>
+      <w:bookmarkEnd w:id="74"/>
     </w:p>
     <w:p/>
     <w:p>
       <w:pPr>
         <w:pStyle w:val="Heading3"/>
       </w:pPr>
-      <w:bookmarkStart w:id="72" w:name="_Toc35934253"/>
+      <w:bookmarkStart w:id="75" w:name="_Toc35934253"/>
       <w:proofErr w:type="spellStart"/>
       <w:r>
         <w:t>reponsecode</w:t>
       </w:r>
-      <w:bookmarkEnd w:id="72"/>
+      <w:bookmarkEnd w:id="75"/>
       <w:proofErr w:type="spellEnd"/>
     </w:p>
     <w:p/>
@@ -13835,12 +13826,12 @@
       <w:pPr>
         <w:pStyle w:val="Heading3"/>
       </w:pPr>
-      <w:bookmarkStart w:id="73" w:name="_Toc35934254"/>
+      <w:bookmarkStart w:id="76" w:name="_Toc35934254"/>
       <w:proofErr w:type="spellStart"/>
       <w:r>
         <w:t>printattr</w:t>
       </w:r>
-      <w:bookmarkEnd w:id="73"/>
+      <w:bookmarkEnd w:id="76"/>
       <w:proofErr w:type="spellEnd"/>
     </w:p>
     <w:p/>
@@ -13899,12 +13890,12 @@
       <w:pPr>
         <w:pStyle w:val="Heading3"/>
       </w:pPr>
-      <w:bookmarkStart w:id="74" w:name="_Toc35934255"/>
+      <w:bookmarkStart w:id="77" w:name="_Toc35934255"/>
       <w:proofErr w:type="spellStart"/>
       <w:r>
         <w:t>timepacket</w:t>
       </w:r>
-      <w:bookmarkEnd w:id="74"/>
+      <w:bookmarkEnd w:id="77"/>
       <w:proofErr w:type="spellEnd"/>
     </w:p>
     <w:p/>
@@ -13995,11 +13986,11 @@
       <w:pPr>
         <w:pStyle w:val="Heading2"/>
       </w:pPr>
-      <w:bookmarkStart w:id="75" w:name="_Toc35934256"/>
+      <w:bookmarkStart w:id="78" w:name="_Toc35934256"/>
       <w:r>
         <w:t>Policy Aids</w:t>
       </w:r>
-      <w:bookmarkEnd w:id="75"/>
+      <w:bookmarkEnd w:id="78"/>
     </w:p>
     <w:p/>
     <w:p>
@@ -14058,11 +14049,11 @@
       <w:pPr>
         <w:pStyle w:val="Heading3"/>
       </w:pPr>
-      <w:bookmarkStart w:id="76" w:name="_Toc35934257"/>
+      <w:bookmarkStart w:id="79" w:name="_Toc35934257"/>
       <w:r>
         <w:t>policymaker</w:t>
       </w:r>
-      <w:bookmarkEnd w:id="76"/>
+      <w:bookmarkEnd w:id="79"/>
     </w:p>
     <w:p/>
     <w:p>
@@ -14143,12 +14134,12 @@
       <w:pPr>
         <w:pStyle w:val="Heading3"/>
       </w:pPr>
-      <w:bookmarkStart w:id="77" w:name="_Toc35934258"/>
+      <w:bookmarkStart w:id="80" w:name="_Toc35934258"/>
       <w:proofErr w:type="spellStart"/>
       <w:r>
         <w:t>policymakerpcr</w:t>
       </w:r>
-      <w:bookmarkEnd w:id="77"/>
+      <w:bookmarkEnd w:id="80"/>
       <w:proofErr w:type="spellEnd"/>
     </w:p>
     <w:p/>
@@ -14183,13 +14174,13 @@
       <w:pPr>
         <w:pStyle w:val="Heading3"/>
       </w:pPr>
-      <w:bookmarkStart w:id="78" w:name="_Toc35934259"/>
+      <w:bookmarkStart w:id="81" w:name="_Toc35934259"/>
       <w:proofErr w:type="spellStart"/>
       <w:proofErr w:type="gramStart"/>
       <w:r>
         <w:t>publicname</w:t>
       </w:r>
-      <w:bookmarkEnd w:id="78"/>
+      <w:bookmarkEnd w:id="81"/>
       <w:proofErr w:type="spellEnd"/>
       <w:proofErr w:type="gramEnd"/>
     </w:p>
@@ -14227,22 +14218,22 @@
       <w:pPr>
         <w:pStyle w:val="Heading2"/>
       </w:pPr>
-      <w:bookmarkStart w:id="79" w:name="_Toc35934260"/>
+      <w:bookmarkStart w:id="82" w:name="_Toc35934260"/>
       <w:r>
         <w:t>Key Manipulation</w:t>
       </w:r>
-      <w:bookmarkEnd w:id="79"/>
+      <w:bookmarkEnd w:id="82"/>
     </w:p>
     <w:p>
       <w:pPr>
         <w:pStyle w:val="Heading3"/>
       </w:pPr>
-      <w:bookmarkStart w:id="80" w:name="_Toc35934261"/>
+      <w:bookmarkStart w:id="83" w:name="_Toc35934261"/>
       <w:proofErr w:type="spellStart"/>
       <w:r>
         <w:t>createek</w:t>
       </w:r>
-      <w:bookmarkEnd w:id="80"/>
+      <w:bookmarkEnd w:id="83"/>
       <w:proofErr w:type="spellEnd"/>
     </w:p>
     <w:p/>
@@ -14337,12 +14328,12 @@
       <w:pPr>
         <w:pStyle w:val="Heading3"/>
       </w:pPr>
-      <w:bookmarkStart w:id="81" w:name="_Toc35934262"/>
+      <w:bookmarkStart w:id="84" w:name="_Toc35934262"/>
       <w:proofErr w:type="spellStart"/>
       <w:r>
         <w:t>createekcert</w:t>
       </w:r>
-      <w:bookmarkEnd w:id="81"/>
+      <w:bookmarkEnd w:id="84"/>
       <w:proofErr w:type="spellEnd"/>
     </w:p>
     <w:p/>
@@ -14391,11 +14382,11 @@
       <w:pPr>
         <w:pStyle w:val="Heading3"/>
       </w:pPr>
-      <w:bookmarkStart w:id="82" w:name="_Toc35934263"/>
+      <w:bookmarkStart w:id="85" w:name="_Toc35934263"/>
       <w:r>
         <w:t>tpm2pem</w:t>
       </w:r>
-      <w:bookmarkEnd w:id="82"/>
+      <w:bookmarkEnd w:id="85"/>
     </w:p>
     <w:p/>
     <w:p>
@@ -14435,11 +14426,11 @@
       <w:pPr>
         <w:pStyle w:val="Heading2"/>
       </w:pPr>
-      <w:bookmarkStart w:id="83" w:name="_Toc35934264"/>
+      <w:bookmarkStart w:id="86" w:name="_Toc35934264"/>
       <w:r>
         <w:t>Event Logs</w:t>
       </w:r>
-      <w:bookmarkEnd w:id="83"/>
+      <w:bookmarkEnd w:id="86"/>
     </w:p>
     <w:p/>
     <w:p>
@@ -14463,12 +14454,12 @@
       <w:pPr>
         <w:pStyle w:val="Heading3"/>
       </w:pPr>
-      <w:bookmarkStart w:id="84" w:name="_Toc35934265"/>
+      <w:bookmarkStart w:id="87" w:name="_Toc35934265"/>
       <w:proofErr w:type="spellStart"/>
       <w:r>
         <w:t>eventextend</w:t>
       </w:r>
-      <w:bookmarkEnd w:id="84"/>
+      <w:bookmarkEnd w:id="87"/>
       <w:proofErr w:type="spellEnd"/>
     </w:p>
     <w:p/>
@@ -14552,12 +14543,12 @@
       <w:pPr>
         <w:pStyle w:val="Heading3"/>
       </w:pPr>
-      <w:bookmarkStart w:id="85" w:name="_Toc35934266"/>
+      <w:bookmarkStart w:id="88" w:name="_Toc35934266"/>
       <w:proofErr w:type="spellStart"/>
       <w:r>
         <w:t>imaextend</w:t>
       </w:r>
-      <w:bookmarkEnd w:id="85"/>
+      <w:bookmarkEnd w:id="88"/>
       <w:proofErr w:type="spellEnd"/>
     </w:p>
     <w:p/>
@@ -14629,11 +14620,11 @@
           <w:sz w:val="22"/>
         </w:rPr>
       </w:pPr>
-      <w:bookmarkStart w:id="86" w:name="_Toc3554834"/>
-      <w:bookmarkStart w:id="87" w:name="_Toc6495738"/>
-      <w:bookmarkStart w:id="88" w:name="_Toc35934267"/>
-      <w:bookmarkEnd w:id="86"/>
-      <w:bookmarkEnd w:id="87"/>
+      <w:bookmarkStart w:id="89" w:name="_Toc3554834"/>
+      <w:bookmarkStart w:id="90" w:name="_Toc6495738"/>
+      <w:bookmarkStart w:id="91" w:name="_Toc35934267"/>
+      <w:bookmarkEnd w:id="89"/>
+      <w:bookmarkEnd w:id="90"/>
       <w:r>
         <w:rPr>
           <w:spacing w:val="8"/>
@@ -14642,7 +14633,7 @@
         <w:lastRenderedPageBreak/>
         <w:t>Build</w:t>
       </w:r>
-      <w:bookmarkEnd w:id="88"/>
+      <w:bookmarkEnd w:id="91"/>
     </w:p>
     <w:p>
       <w:r>
@@ -14708,12 +14699,12 @@
       <w:pPr>
         <w:pStyle w:val="Heading2"/>
       </w:pPr>
-      <w:bookmarkStart w:id="89" w:name="_Toc35934268"/>
-      <w:bookmarkStart w:id="90" w:name="_Ref156904153"/>
+      <w:bookmarkStart w:id="92" w:name="_Toc35934268"/>
+      <w:bookmarkStart w:id="93" w:name="_Ref156904153"/>
       <w:r>
         <w:t>Build Options</w:t>
       </w:r>
-      <w:bookmarkEnd w:id="89"/>
+      <w:bookmarkEnd w:id="92"/>
     </w:p>
     <w:p/>
     <w:p>
@@ -14752,11 +14743,11 @@
       <w:pPr>
         <w:pStyle w:val="Heading3"/>
       </w:pPr>
-      <w:bookmarkStart w:id="91" w:name="_Toc35934269"/>
+      <w:bookmarkStart w:id="94" w:name="_Toc35934269"/>
       <w:r>
         <w:t>TPM_TPM20 and TPM_TPM12</w:t>
       </w:r>
-      <w:bookmarkEnd w:id="91"/>
+      <w:bookmarkEnd w:id="94"/>
     </w:p>
     <w:p/>
     <w:p>
@@ -14821,11 +14812,11 @@
       <w:pPr>
         <w:pStyle w:val="Heading3"/>
       </w:pPr>
-      <w:bookmarkStart w:id="92" w:name="_Toc35934270"/>
+      <w:bookmarkStart w:id="95" w:name="_Toc35934270"/>
       <w:r>
         <w:t>TPM_POSIX or TPM_WINDOWS</w:t>
       </w:r>
-      <w:bookmarkEnd w:id="92"/>
+      <w:bookmarkEnd w:id="95"/>
     </w:p>
     <w:p/>
     <w:p>
@@ -14861,11 +14852,11 @@
       <w:pPr>
         <w:pStyle w:val="Heading3"/>
       </w:pPr>
-      <w:bookmarkStart w:id="93" w:name="_Toc35934271"/>
+      <w:bookmarkStart w:id="96" w:name="_Toc35934271"/>
       <w:r>
         <w:t>TPM_WINDOWS_TBSI</w:t>
       </w:r>
-      <w:bookmarkEnd w:id="93"/>
+      <w:bookmarkEnd w:id="96"/>
     </w:p>
     <w:p/>
     <w:p>
@@ -14891,21 +14882,21 @@
       <w:pPr>
         <w:pStyle w:val="Heading3"/>
       </w:pPr>
-      <w:bookmarkStart w:id="94" w:name="_Toc35934273"/>
-      <w:bookmarkStart w:id="95" w:name="_Toc35934274"/>
-      <w:bookmarkStart w:id="96" w:name="_Toc35934275"/>
-      <w:bookmarkStart w:id="97" w:name="_Toc35934276"/>
-      <w:bookmarkStart w:id="98" w:name="_Toc35934277"/>
-      <w:bookmarkStart w:id="99" w:name="_Toc35934278"/>
-      <w:bookmarkEnd w:id="94"/>
-      <w:bookmarkEnd w:id="95"/>
-      <w:bookmarkEnd w:id="96"/>
+      <w:bookmarkStart w:id="97" w:name="_Toc35934273"/>
+      <w:bookmarkStart w:id="98" w:name="_Toc35934274"/>
+      <w:bookmarkStart w:id="99" w:name="_Toc35934275"/>
+      <w:bookmarkStart w:id="100" w:name="_Toc35934276"/>
+      <w:bookmarkStart w:id="101" w:name="_Toc35934277"/>
+      <w:bookmarkStart w:id="102" w:name="_Toc35934278"/>
       <w:bookmarkEnd w:id="97"/>
       <w:bookmarkEnd w:id="98"/>
+      <w:bookmarkEnd w:id="99"/>
+      <w:bookmarkEnd w:id="100"/>
+      <w:bookmarkEnd w:id="101"/>
       <w:r>
         <w:t>TPM_TSS_NOFILE</w:t>
       </w:r>
-      <w:bookmarkEnd w:id="99"/>
+      <w:bookmarkEnd w:id="102"/>
     </w:p>
     <w:p/>
     <w:p>
@@ -14976,11 +14967,11 @@
       <w:pPr>
         <w:pStyle w:val="Heading3"/>
       </w:pPr>
-      <w:bookmarkStart w:id="100" w:name="_Toc35934279"/>
+      <w:bookmarkStart w:id="103" w:name="_Toc35934279"/>
       <w:r>
         <w:t>TPM_TSS_NOCRYPTO</w:t>
       </w:r>
-      <w:bookmarkEnd w:id="100"/>
+      <w:bookmarkEnd w:id="103"/>
     </w:p>
     <w:p/>
     <w:p>
@@ -15038,7 +15029,7 @@
       <w:pPr>
         <w:pStyle w:val="Heading3"/>
       </w:pPr>
-      <w:bookmarkStart w:id="101" w:name="_Toc35934280"/>
+      <w:bookmarkStart w:id="104" w:name="_Toc35934280"/>
       <w:r>
         <w:t>TPM_</w:t>
       </w:r>
@@ -15048,7 +15039,7 @@
       <w:r>
         <w:t>NO_PRINT</w:t>
       </w:r>
-      <w:bookmarkEnd w:id="101"/>
+      <w:bookmarkEnd w:id="104"/>
     </w:p>
     <w:p/>
     <w:p>
@@ -15067,11 +15058,11 @@
       <w:pPr>
         <w:pStyle w:val="Heading3"/>
       </w:pPr>
-      <w:bookmarkStart w:id="102" w:name="_Toc35934281"/>
+      <w:bookmarkStart w:id="105" w:name="_Toc35934281"/>
       <w:r>
         <w:t>TPM_TSS_NOECC</w:t>
       </w:r>
-      <w:bookmarkEnd w:id="102"/>
+      <w:bookmarkEnd w:id="105"/>
     </w:p>
     <w:p/>
     <w:p>
@@ -15090,11 +15081,11 @@
       <w:pPr>
         <w:pStyle w:val="Heading3"/>
       </w:pPr>
-      <w:bookmarkStart w:id="103" w:name="_Toc35934282"/>
+      <w:bookmarkStart w:id="106" w:name="_Toc35934282"/>
       <w:r>
         <w:t>TPM_TSS_NORSA</w:t>
       </w:r>
-      <w:bookmarkEnd w:id="103"/>
+      <w:bookmarkEnd w:id="106"/>
     </w:p>
     <w:p/>
     <w:p>
@@ -15113,11 +15104,11 @@
       <w:pPr>
         <w:pStyle w:val="Heading3"/>
       </w:pPr>
-      <w:bookmarkStart w:id="104" w:name="_Toc35934283"/>
+      <w:bookmarkStart w:id="107" w:name="_Toc35934283"/>
       <w:r>
         <w:t>TPM_TSS_NOENV</w:t>
       </w:r>
-      <w:bookmarkEnd w:id="104"/>
+      <w:bookmarkEnd w:id="107"/>
     </w:p>
     <w:p/>
     <w:p>
@@ -15165,15 +15156,15 @@
       <w:pPr>
         <w:pStyle w:val="Heading3"/>
       </w:pPr>
-      <w:bookmarkStart w:id="105" w:name="_Toc35934284"/>
-      <w:bookmarkStart w:id="106" w:name="_Toc35934285"/>
-      <w:bookmarkStart w:id="107" w:name="_Toc35934286"/>
-      <w:bookmarkEnd w:id="105"/>
-      <w:bookmarkEnd w:id="106"/>
+      <w:bookmarkStart w:id="108" w:name="_Toc35934284"/>
+      <w:bookmarkStart w:id="109" w:name="_Toc35934285"/>
+      <w:bookmarkStart w:id="110" w:name="_Toc35934286"/>
+      <w:bookmarkEnd w:id="108"/>
+      <w:bookmarkEnd w:id="109"/>
       <w:r>
         <w:t>TPM_NOSOCKET</w:t>
       </w:r>
-      <w:bookmarkEnd w:id="107"/>
+      <w:bookmarkEnd w:id="110"/>
     </w:p>
     <w:p/>
     <w:p>
@@ -15252,14 +15243,14 @@
       <w:pPr>
         <w:pStyle w:val="Heading3"/>
       </w:pPr>
-      <w:bookmarkStart w:id="108" w:name="_Toc35934287"/>
+      <w:bookmarkStart w:id="111" w:name="_Toc35934287"/>
       <w:r>
         <w:t>TPM_TSS_</w:t>
       </w:r>
       <w:r>
         <w:t>NOCMDCHECK</w:t>
       </w:r>
-      <w:bookmarkEnd w:id="108"/>
+      <w:bookmarkEnd w:id="111"/>
     </w:p>
     <w:p/>
     <w:p>
@@ -15283,11 +15274,11 @@
         <w:t xml:space="preserve"> two </w:t>
       </w:r>
       <w:r>
-        <w:t>main use cases of this macro</w:t>
+        <w:t>main use cases</w:t>
       </w:r>
       <w:proofErr w:type="gramEnd"/>
       <w:r>
-        <w:t xml:space="preserve"> are:</w:t>
+        <w:t xml:space="preserve"> of this macro are:</w:t>
       </w:r>
     </w:p>
     <w:p/>
@@ -15336,11 +15327,11 @@
       <w:pPr>
         <w:pStyle w:val="Heading3"/>
       </w:pPr>
-      <w:bookmarkStart w:id="109" w:name="_Toc35934288"/>
+      <w:bookmarkStart w:id="112" w:name="_Toc35934288"/>
       <w:r>
         <w:t>TPM_TSS_NODEPRECATED</w:t>
       </w:r>
-      <w:bookmarkEnd w:id="109"/>
+      <w:bookmarkEnd w:id="112"/>
     </w:p>
     <w:p/>
     <w:p>
@@ -15362,12 +15353,12 @@
       <w:pPr>
         <w:pStyle w:val="Heading3"/>
       </w:pPr>
-      <w:bookmarkStart w:id="110" w:name="_Toc35934289"/>
-      <w:bookmarkStart w:id="111" w:name="_Ref201241396"/>
+      <w:bookmarkStart w:id="113" w:name="_Ref201241396"/>
+      <w:bookmarkStart w:id="114" w:name="_Toc35934289"/>
       <w:r>
         <w:t>TPM_TSS_NODEPRECATEDALGS</w:t>
       </w:r>
-      <w:bookmarkEnd w:id="111"/>
+      <w:bookmarkEnd w:id="113"/>
     </w:p>
     <w:p/>
     <w:p>
@@ -15388,7 +15379,7 @@
     <w:p>
       <w:pPr>
         <w:rPr>
-          <w:ins w:id="112" w:author="Kenneth Goldman" w:date="2025-06-19T15:55:00Z"/>
+          <w:ins w:id="115" w:author="Kenneth Goldman" w:date="2025-06-19T15:55:00Z"/>
         </w:rPr>
       </w:pPr>
       <w:r>
@@ -15410,17 +15401,17 @@
     <w:p>
       <w:pPr>
         <w:rPr>
-          <w:ins w:id="113" w:author="Kenneth Goldman" w:date="2025-06-19T15:55:00Z"/>
+          <w:ins w:id="116" w:author="Kenneth Goldman" w:date="2025-06-19T15:55:00Z"/>
         </w:rPr>
       </w:pPr>
     </w:p>
     <w:p>
-      <w:ins w:id="114" w:author="Kenneth Goldman" w:date="2025-06-19T15:55:00Z">
+      <w:ins w:id="117" w:author="Kenneth Goldman" w:date="2025-06-19T15:55:00Z">
         <w:r>
           <w:t xml:space="preserve">This is required for the OpenSSL packaged with Fedora, </w:t>
         </w:r>
       </w:ins>
-      <w:ins w:id="115" w:author="Kenneth Goldman" w:date="2025-06-19T15:56:00Z">
+      <w:ins w:id="118" w:author="Kenneth Goldman" w:date="2025-06-19T15:56:00Z">
         <w:r>
           <w:t>which removes SHA-1 support.</w:t>
         </w:r>
@@ -15435,7 +15426,7 @@
         <w:lastRenderedPageBreak/>
         <w:t>TPM_TSS_NUVOTON</w:t>
       </w:r>
-      <w:bookmarkEnd w:id="110"/>
+      <w:bookmarkEnd w:id="114"/>
     </w:p>
     <w:p/>
     <w:p>
@@ -15451,11 +15442,11 @@
       <w:pPr>
         <w:pStyle w:val="Heading2"/>
       </w:pPr>
-      <w:bookmarkStart w:id="116" w:name="_Toc35934290"/>
+      <w:bookmarkStart w:id="119" w:name="_Toc35934290"/>
       <w:r>
         <w:t>Directories</w:t>
       </w:r>
-      <w:bookmarkEnd w:id="116"/>
+      <w:bookmarkEnd w:id="119"/>
     </w:p>
     <w:p/>
     <w:p>
@@ -15649,12 +15640,12 @@
       <w:pPr>
         <w:pStyle w:val="Heading2"/>
       </w:pPr>
-      <w:bookmarkStart w:id="117" w:name="_Toc35934291"/>
+      <w:bookmarkStart w:id="120" w:name="_Toc35934291"/>
       <w:r>
         <w:t>Linux</w:t>
       </w:r>
-      <w:bookmarkEnd w:id="90"/>
-      <w:bookmarkEnd w:id="117"/>
+      <w:bookmarkEnd w:id="93"/>
+      <w:bookmarkEnd w:id="120"/>
     </w:p>
     <w:p/>
     <w:p>
@@ -15790,12 +15781,12 @@
       <w:pPr>
         <w:pStyle w:val="Heading2"/>
       </w:pPr>
-      <w:bookmarkStart w:id="118" w:name="_Toc35934292"/>
+      <w:bookmarkStart w:id="121" w:name="_Toc35934292"/>
       <w:r>
         <w:lastRenderedPageBreak/>
         <w:t>Windows</w:t>
       </w:r>
-      <w:bookmarkEnd w:id="118"/>
+      <w:bookmarkEnd w:id="121"/>
     </w:p>
     <w:p/>
     <w:p>
@@ -15969,11 +15960,11 @@
       <w:pPr>
         <w:pStyle w:val="Heading3"/>
       </w:pPr>
-      <w:bookmarkStart w:id="119" w:name="_Toc35934293"/>
+      <w:bookmarkStart w:id="122" w:name="_Toc35934293"/>
       <w:r>
         <w:t>Windows gcc</w:t>
       </w:r>
-      <w:bookmarkEnd w:id="119"/>
+      <w:bookmarkEnd w:id="122"/>
     </w:p>
     <w:p/>
     <w:p>
@@ -16078,22 +16069,19 @@
       <w:pPr>
         <w:pStyle w:val="Heading3"/>
       </w:pPr>
-      <w:bookmarkStart w:id="120" w:name="_Toc26799912"/>
-      <w:bookmarkStart w:id="121" w:name="_Toc35934294"/>
-      <w:bookmarkStart w:id="122" w:name="_Toc26799913"/>
-      <w:bookmarkStart w:id="123" w:name="_Toc35934295"/>
-      <w:bookmarkStart w:id="124" w:name="_Toc26799914"/>
-      <w:bookmarkStart w:id="125" w:name="_Toc35934296"/>
-      <w:bookmarkStart w:id="126" w:name="_Toc26799915"/>
-      <w:bookmarkStart w:id="127" w:name="_Toc35934297"/>
-      <w:bookmarkStart w:id="128" w:name="_Toc26799916"/>
-      <w:bookmarkStart w:id="129" w:name="_Toc35934298"/>
-      <w:bookmarkStart w:id="130" w:name="_Toc26799917"/>
-      <w:bookmarkStart w:id="131" w:name="_Toc35934299"/>
-      <w:bookmarkStart w:id="132" w:name="_Toc35934300"/>
-      <w:bookmarkEnd w:id="120"/>
-      <w:bookmarkEnd w:id="121"/>
-      <w:bookmarkEnd w:id="122"/>
+      <w:bookmarkStart w:id="123" w:name="_Toc26799912"/>
+      <w:bookmarkStart w:id="124" w:name="_Toc35934294"/>
+      <w:bookmarkStart w:id="125" w:name="_Toc26799913"/>
+      <w:bookmarkStart w:id="126" w:name="_Toc35934295"/>
+      <w:bookmarkStart w:id="127" w:name="_Toc26799914"/>
+      <w:bookmarkStart w:id="128" w:name="_Toc35934296"/>
+      <w:bookmarkStart w:id="129" w:name="_Toc26799915"/>
+      <w:bookmarkStart w:id="130" w:name="_Toc35934297"/>
+      <w:bookmarkStart w:id="131" w:name="_Toc26799916"/>
+      <w:bookmarkStart w:id="132" w:name="_Toc35934298"/>
+      <w:bookmarkStart w:id="133" w:name="_Toc26799917"/>
+      <w:bookmarkStart w:id="134" w:name="_Toc35934299"/>
+      <w:bookmarkStart w:id="135" w:name="_Toc35934300"/>
       <w:bookmarkEnd w:id="123"/>
       <w:bookmarkEnd w:id="124"/>
       <w:bookmarkEnd w:id="125"/>
@@ -16103,11 +16091,14 @@
       <w:bookmarkEnd w:id="129"/>
       <w:bookmarkEnd w:id="130"/>
       <w:bookmarkEnd w:id="131"/>
+      <w:bookmarkEnd w:id="132"/>
+      <w:bookmarkEnd w:id="133"/>
+      <w:bookmarkEnd w:id="134"/>
       <w:r>
         <w:lastRenderedPageBreak/>
         <w:t>Windows Visual Studio</w:t>
       </w:r>
-      <w:bookmarkEnd w:id="132"/>
+      <w:bookmarkEnd w:id="135"/>
     </w:p>
     <w:p/>
     <w:p>
@@ -16549,16 +16540,16 @@
       <w:pPr>
         <w:pStyle w:val="Heading2"/>
       </w:pPr>
-      <w:bookmarkStart w:id="133" w:name="_Toc432519259"/>
-      <w:bookmarkStart w:id="134" w:name="_Toc432519260"/>
-      <w:bookmarkStart w:id="135" w:name="_Ref154678203"/>
-      <w:bookmarkStart w:id="136" w:name="_Toc35934302"/>
-      <w:bookmarkEnd w:id="133"/>
-      <w:bookmarkEnd w:id="134"/>
+      <w:bookmarkStart w:id="136" w:name="_Toc432519259"/>
+      <w:bookmarkStart w:id="137" w:name="_Toc432519260"/>
+      <w:bookmarkStart w:id="138" w:name="_Ref154678203"/>
+      <w:bookmarkStart w:id="139" w:name="_Toc35934302"/>
+      <w:bookmarkEnd w:id="136"/>
+      <w:bookmarkEnd w:id="137"/>
       <w:r>
         <w:t>Regression Test</w:t>
       </w:r>
-      <w:bookmarkEnd w:id="135"/>
+      <w:bookmarkEnd w:id="138"/>
     </w:p>
     <w:p/>
     <w:p>
@@ -16887,7 +16878,7 @@
       <w:r>
         <w:t>Mac</w:t>
       </w:r>
-      <w:bookmarkEnd w:id="136"/>
+      <w:bookmarkEnd w:id="139"/>
     </w:p>
     <w:p/>
     <w:p>
@@ -17018,11 +17009,11 @@
       <w:pPr>
         <w:pStyle w:val="Heading2"/>
       </w:pPr>
-      <w:bookmarkStart w:id="137" w:name="_Toc35934303"/>
+      <w:bookmarkStart w:id="140" w:name="_Toc35934303"/>
       <w:r>
         <w:t>AIX</w:t>
       </w:r>
-      <w:bookmarkEnd w:id="137"/>
+      <w:bookmarkEnd w:id="140"/>
     </w:p>
     <w:p/>
     <w:p>
@@ -17132,31 +17123,28 @@
           <w:sz w:val="22"/>
         </w:rPr>
       </w:pPr>
-      <w:bookmarkStart w:id="138" w:name="_Toc467152829"/>
-      <w:bookmarkStart w:id="139" w:name="_Toc467152831"/>
-      <w:bookmarkStart w:id="140" w:name="_Toc467152832"/>
-      <w:bookmarkStart w:id="141" w:name="_Toc467152837"/>
-      <w:bookmarkStart w:id="142" w:name="_Toc154370782"/>
-      <w:bookmarkStart w:id="143" w:name="_Toc154371349"/>
-      <w:bookmarkStart w:id="144" w:name="_Toc154371458"/>
-      <w:bookmarkStart w:id="145" w:name="_Toc154383391"/>
-      <w:bookmarkStart w:id="146" w:name="_Toc154384105"/>
-      <w:bookmarkStart w:id="147" w:name="_Toc154384265"/>
-      <w:bookmarkStart w:id="148" w:name="_Toc154554698"/>
-      <w:bookmarkStart w:id="149" w:name="_Toc156112646"/>
-      <w:bookmarkStart w:id="150" w:name="_Toc156116350"/>
-      <w:bookmarkStart w:id="151" w:name="_Toc145317310"/>
-      <w:bookmarkStart w:id="152" w:name="_Toc145317372"/>
-      <w:bookmarkStart w:id="153" w:name="_Toc145317878"/>
-      <w:bookmarkStart w:id="154" w:name="_Toc145318604"/>
-      <w:bookmarkStart w:id="155" w:name="_Toc145318669"/>
-      <w:bookmarkStart w:id="156" w:name="_Toc145328450"/>
-      <w:bookmarkStart w:id="157" w:name="_Toc145388433"/>
-      <w:bookmarkStart w:id="158" w:name="_Toc145754964"/>
-      <w:bookmarkStart w:id="159" w:name="_Toc35934304"/>
-      <w:bookmarkEnd w:id="138"/>
-      <w:bookmarkEnd w:id="139"/>
-      <w:bookmarkEnd w:id="140"/>
+      <w:bookmarkStart w:id="141" w:name="_Toc467152829"/>
+      <w:bookmarkStart w:id="142" w:name="_Toc467152831"/>
+      <w:bookmarkStart w:id="143" w:name="_Toc467152832"/>
+      <w:bookmarkStart w:id="144" w:name="_Toc467152837"/>
+      <w:bookmarkStart w:id="145" w:name="_Toc154370782"/>
+      <w:bookmarkStart w:id="146" w:name="_Toc154371349"/>
+      <w:bookmarkStart w:id="147" w:name="_Toc154371458"/>
+      <w:bookmarkStart w:id="148" w:name="_Toc154383391"/>
+      <w:bookmarkStart w:id="149" w:name="_Toc154384105"/>
+      <w:bookmarkStart w:id="150" w:name="_Toc154384265"/>
+      <w:bookmarkStart w:id="151" w:name="_Toc154554698"/>
+      <w:bookmarkStart w:id="152" w:name="_Toc156112646"/>
+      <w:bookmarkStart w:id="153" w:name="_Toc156116350"/>
+      <w:bookmarkStart w:id="154" w:name="_Toc145317310"/>
+      <w:bookmarkStart w:id="155" w:name="_Toc145317372"/>
+      <w:bookmarkStart w:id="156" w:name="_Toc145317878"/>
+      <w:bookmarkStart w:id="157" w:name="_Toc145318604"/>
+      <w:bookmarkStart w:id="158" w:name="_Toc145318669"/>
+      <w:bookmarkStart w:id="159" w:name="_Toc145328450"/>
+      <w:bookmarkStart w:id="160" w:name="_Toc145388433"/>
+      <w:bookmarkStart w:id="161" w:name="_Toc145754964"/>
+      <w:bookmarkStart w:id="162" w:name="_Toc35934304"/>
       <w:bookmarkEnd w:id="141"/>
       <w:bookmarkEnd w:id="142"/>
       <w:bookmarkEnd w:id="143"/>
@@ -17175,6 +17163,9 @@
       <w:bookmarkEnd w:id="156"/>
       <w:bookmarkEnd w:id="157"/>
       <w:bookmarkEnd w:id="158"/>
+      <w:bookmarkEnd w:id="159"/>
+      <w:bookmarkEnd w:id="160"/>
+      <w:bookmarkEnd w:id="161"/>
       <w:r>
         <w:rPr>
           <w:spacing w:val="8"/>
@@ -17183,7 +17174,7 @@
         <w:lastRenderedPageBreak/>
         <w:t>Fedora</w:t>
       </w:r>
-      <w:bookmarkEnd w:id="159"/>
+      <w:bookmarkEnd w:id="162"/>
     </w:p>
     <w:p>
       <w:r>
@@ -17221,14 +17212,14 @@
       <w:pPr>
         <w:pStyle w:val="Heading2"/>
       </w:pPr>
-      <w:bookmarkStart w:id="160" w:name="_Toc35934305"/>
+      <w:bookmarkStart w:id="163" w:name="_Toc35934305"/>
       <w:r>
         <w:t xml:space="preserve">Local </w:t>
       </w:r>
       <w:r>
         <w:t>Install</w:t>
       </w:r>
-      <w:bookmarkEnd w:id="160"/>
+      <w:bookmarkEnd w:id="163"/>
     </w:p>
     <w:p/>
     <w:p>
@@ -17351,11 +17342,11 @@
       </w:r>
       <w:proofErr w:type="spellStart"/>
       <w:r>
-        <w:t>tss</w:t>
+        <w:t>tss'</w:t>
       </w:r>
       <w:proofErr w:type="spellEnd"/>
       <w:r>
-        <w:t>' prefix.</w:t>
+        <w:t xml:space="preserve"> prefix.</w:t>
       </w:r>
     </w:p>
     <w:p>
@@ -17611,11 +17602,11 @@
       <w:pPr>
         <w:pStyle w:val="Heading2"/>
       </w:pPr>
-      <w:bookmarkStart w:id="161" w:name="_Toc35934306"/>
+      <w:bookmarkStart w:id="164" w:name="_Toc35934306"/>
       <w:r>
         <w:t>Alternative Local Install</w:t>
       </w:r>
-      <w:bookmarkEnd w:id="161"/>
+      <w:bookmarkEnd w:id="164"/>
     </w:p>
     <w:p/>
     <w:p/>
@@ -17744,11 +17735,11 @@
       <w:pPr>
         <w:pStyle w:val="Heading2"/>
       </w:pPr>
-      <w:bookmarkStart w:id="162" w:name="_Toc35934307"/>
+      <w:bookmarkStart w:id="165" w:name="_Toc35934307"/>
       <w:r>
         <w:t>Repository Install</w:t>
       </w:r>
-      <w:bookmarkEnd w:id="162"/>
+      <w:bookmarkEnd w:id="165"/>
     </w:p>
     <w:p/>
     <w:p>
@@ -17783,11 +17774,11 @@
       <w:pPr>
         <w:pStyle w:val="Heading2"/>
       </w:pPr>
-      <w:bookmarkStart w:id="163" w:name="_Toc35934308"/>
+      <w:bookmarkStart w:id="166" w:name="_Toc35934308"/>
       <w:r>
         <w:t>Install Test</w:t>
       </w:r>
-      <w:bookmarkEnd w:id="163"/>
+      <w:bookmarkEnd w:id="166"/>
     </w:p>
     <w:p/>
     <w:p>
@@ -17923,13 +17914,13 @@
       <w:pPr>
         <w:pStyle w:val="Heading2"/>
       </w:pPr>
-      <w:bookmarkStart w:id="164" w:name="_Ref456884269"/>
-      <w:bookmarkStart w:id="165" w:name="_Toc35934309"/>
+      <w:bookmarkStart w:id="167" w:name="_Ref456884269"/>
+      <w:bookmarkStart w:id="168" w:name="_Toc35934309"/>
       <w:r>
         <w:t>Source rpms</w:t>
       </w:r>
-      <w:bookmarkEnd w:id="164"/>
-      <w:bookmarkEnd w:id="165"/>
+      <w:bookmarkEnd w:id="167"/>
+      <w:bookmarkEnd w:id="168"/>
     </w:p>
     <w:p/>
     <w:p>
@@ -18018,7 +18009,7 @@
           <w:sz w:val="22"/>
         </w:rPr>
       </w:pPr>
-      <w:bookmarkStart w:id="166" w:name="_Toc35934310"/>
+      <w:bookmarkStart w:id="169" w:name="_Toc35934310"/>
       <w:r>
         <w:rPr>
           <w:spacing w:val="8"/>
@@ -18027,23 +18018,23 @@
         <w:lastRenderedPageBreak/>
         <w:t>Status</w:t>
       </w:r>
-      <w:bookmarkEnd w:id="166"/>
+      <w:bookmarkEnd w:id="169"/>
     </w:p>
     <w:p>
       <w:pPr>
         <w:pStyle w:val="Heading2"/>
       </w:pPr>
-      <w:bookmarkStart w:id="167" w:name="_Toc458078490"/>
-      <w:bookmarkStart w:id="168" w:name="_Toc458078536"/>
-      <w:bookmarkStart w:id="169" w:name="_Toc458503980"/>
-      <w:bookmarkStart w:id="170" w:name="_Toc35934311"/>
-      <w:bookmarkEnd w:id="167"/>
-      <w:bookmarkEnd w:id="168"/>
-      <w:bookmarkEnd w:id="169"/>
+      <w:bookmarkStart w:id="170" w:name="_Toc458078490"/>
+      <w:bookmarkStart w:id="171" w:name="_Toc458078536"/>
+      <w:bookmarkStart w:id="172" w:name="_Toc458503980"/>
+      <w:bookmarkStart w:id="173" w:name="_Toc35934311"/>
+      <w:bookmarkEnd w:id="170"/>
+      <w:bookmarkEnd w:id="171"/>
+      <w:bookmarkEnd w:id="172"/>
       <w:r>
         <w:t>Utilities</w:t>
       </w:r>
-      <w:bookmarkEnd w:id="170"/>
+      <w:bookmarkEnd w:id="173"/>
     </w:p>
     <w:p/>
     <w:p>
@@ -18166,14 +18157,14 @@
       <w:pPr>
         <w:pStyle w:val="Heading2"/>
       </w:pPr>
-      <w:bookmarkStart w:id="171" w:name="_Toc35934312"/>
+      <w:bookmarkStart w:id="174" w:name="_Toc35934312"/>
       <w:r>
         <w:t>B</w:t>
       </w:r>
       <w:r>
         <w:t>ugs</w:t>
       </w:r>
-      <w:bookmarkEnd w:id="171"/>
+      <w:bookmarkEnd w:id="174"/>
     </w:p>
     <w:p/>
     <w:p>
@@ -18186,11 +18177,11 @@
       <w:pPr>
         <w:pStyle w:val="Heading2"/>
       </w:pPr>
-      <w:bookmarkStart w:id="172" w:name="_Toc35934313"/>
+      <w:bookmarkStart w:id="175" w:name="_Toc35934313"/>
       <w:r>
         <w:t>Untested</w:t>
       </w:r>
-      <w:bookmarkEnd w:id="172"/>
+      <w:bookmarkEnd w:id="175"/>
     </w:p>
     <w:p/>
     <w:p>
@@ -18226,7 +18217,15 @@
         <w:t xml:space="preserve"> </w:t>
       </w:r>
       <w:r>
-        <w:t xml:space="preserve">- ECDH_KeyGen, </w:t>
+        <w:t xml:space="preserve">- </w:t>
+      </w:r>
+      <w:proofErr w:type="spellStart"/>
+      <w:r>
+        <w:t>ECDH_KeyGen</w:t>
+      </w:r>
+      <w:proofErr w:type="spellEnd"/>
+      <w:r>
+        <w:t xml:space="preserve">, </w:t>
       </w:r>
       <w:proofErr w:type="spellStart"/>
       <w:r>
@@ -18292,7 +18291,7 @@
           <w:sz w:val="22"/>
         </w:rPr>
       </w:pPr>
-      <w:bookmarkStart w:id="173" w:name="_Toc35934314"/>
+      <w:bookmarkStart w:id="176" w:name="_Toc35934314"/>
       <w:r>
         <w:rPr>
           <w:spacing w:val="8"/>
@@ -18301,7 +18300,7 @@
         <w:lastRenderedPageBreak/>
         <w:t>Threading</w:t>
       </w:r>
-      <w:bookmarkEnd w:id="173"/>
+      <w:bookmarkEnd w:id="176"/>
     </w:p>
     <w:p/>
     <w:p>
@@ -18343,15 +18342,7 @@
         </w:numPr>
       </w:pPr>
       <w:r>
-        <w:t xml:space="preserve">The TPM has </w:t>
-      </w:r>
-      <w:proofErr w:type="gramStart"/>
-      <w:r>
-        <w:t>session state</w:t>
-      </w:r>
-      <w:proofErr w:type="gramEnd"/>
-      <w:r>
-        <w:t xml:space="preserve"> that </w:t>
+        <w:t xml:space="preserve">The TPM has session state that </w:t>
       </w:r>
       <w:proofErr w:type="gramStart"/>
       <w:r>
@@ -18411,7 +18402,7 @@
           <w:sz w:val="22"/>
         </w:rPr>
       </w:pPr>
-      <w:bookmarkStart w:id="174" w:name="_Toc35934315"/>
+      <w:bookmarkStart w:id="177" w:name="_Toc35934315"/>
       <w:r>
         <w:rPr>
           <w:spacing w:val="8"/>
@@ -18420,7 +18411,7 @@
         <w:lastRenderedPageBreak/>
         <w:t>Troubleshooting</w:t>
       </w:r>
-      <w:bookmarkEnd w:id="174"/>
+      <w:bookmarkEnd w:id="177"/>
     </w:p>
     <w:p>
       <w:r>
@@ -18433,7 +18424,7 @@
       <w:pPr>
         <w:pStyle w:val="Heading2"/>
       </w:pPr>
-      <w:bookmarkStart w:id="175" w:name="_Toc35934316"/>
+      <w:bookmarkStart w:id="178" w:name="_Toc35934316"/>
       <w:proofErr w:type="gramStart"/>
       <w:r>
         <w:t>Environment</w:t>
@@ -18442,7 +18433,7 @@
       <w:r>
         <w:t xml:space="preserve"> Variables</w:t>
       </w:r>
-      <w:bookmarkEnd w:id="175"/>
+      <w:bookmarkEnd w:id="178"/>
     </w:p>
     <w:p/>
     <w:p>
@@ -18511,11 +18502,11 @@
       <w:pPr>
         <w:pStyle w:val="Heading2"/>
       </w:pPr>
-      <w:bookmarkStart w:id="176" w:name="_Toc35934317"/>
+      <w:bookmarkStart w:id="179" w:name="_Toc35934317"/>
       <w:r>
         <w:t>Command line utilities fail on Windows 10</w:t>
       </w:r>
-      <w:bookmarkEnd w:id="176"/>
+      <w:bookmarkEnd w:id="179"/>
     </w:p>
     <w:p/>
     <w:p>
@@ -18543,7 +18534,7 @@
     <w:p>
       <w:pPr>
         <w:rPr>
-          <w:ins w:id="177" w:author="Kenneth Goldman" w:date="2025-06-19T15:54:00Z"/>
+          <w:ins w:id="180" w:author="Kenneth Goldman" w:date="2025-06-19T15:54:00Z"/>
         </w:rPr>
       </w:pPr>
       <w:r>
@@ -18553,12 +18544,12 @@
     <w:p>
       <w:pPr>
         <w:rPr>
-          <w:ins w:id="178" w:author="Kenneth Goldman" w:date="2025-06-19T15:54:00Z"/>
+          <w:ins w:id="181" w:author="Kenneth Goldman" w:date="2025-06-19T15:54:00Z"/>
         </w:rPr>
       </w:pPr>
     </w:p>
     <w:p>
-      <w:ins w:id="179" w:author="Kenneth Goldman" w:date="2025-06-19T15:54:00Z">
+      <w:ins w:id="182" w:author="Kenneth Goldman" w:date="2025-06-19T15:54:00Z">
         <w:r>
           <w:t>Windows 11 does not have this issue.</w:t>
         </w:r>
@@ -18569,14 +18560,14 @@
       <w:pPr>
         <w:pStyle w:val="Heading2"/>
       </w:pPr>
-      <w:bookmarkStart w:id="180" w:name="_Toc35934318"/>
+      <w:bookmarkStart w:id="183" w:name="_Toc35934318"/>
       <w:r>
         <w:t>OpenSSL Linking</w:t>
       </w:r>
       <w:r>
         <w:t xml:space="preserve"> on Windows</w:t>
       </w:r>
-      <w:bookmarkEnd w:id="180"/>
+      <w:bookmarkEnd w:id="183"/>
     </w:p>
     <w:p/>
     <w:p>
@@ -18619,11 +18610,11 @@
       <w:pPr>
         <w:pStyle w:val="Heading2"/>
       </w:pPr>
-      <w:bookmarkStart w:id="181" w:name="_Toc35934319"/>
+      <w:bookmarkStart w:id="184" w:name="_Toc35934319"/>
       <w:r>
         <w:t>Loaded objects (keys) disappear</w:t>
       </w:r>
-      <w:bookmarkEnd w:id="181"/>
+      <w:bookmarkEnd w:id="184"/>
     </w:p>
     <w:p/>
     <w:p>
@@ -18696,10 +18687,10 @@
       <w:pPr>
         <w:pStyle w:val="Heading2"/>
         <w:rPr>
-          <w:ins w:id="182" w:author="Kenneth Goldman" w:date="2025-06-19T15:56:00Z"/>
+          <w:ins w:id="185" w:author="Kenneth Goldman" w:date="2025-06-19T15:56:00Z"/>
         </w:rPr>
       </w:pPr>
-      <w:ins w:id="183" w:author="Kenneth Goldman" w:date="2025-06-19T15:56:00Z">
+      <w:ins w:id="186" w:author="Kenneth Goldman" w:date="2025-06-19T15:56:00Z">
         <w:r>
           <w:t>Regression Test Fails on Fedora</w:t>
         </w:r>
@@ -18708,90 +18699,44 @@
     <w:p>
       <w:pPr>
         <w:rPr>
-          <w:ins w:id="184" w:author="Kenneth Goldman" w:date="2025-06-19T16:00:00Z"/>
+          <w:ins w:id="187" w:author="Kenneth Goldman" w:date="2025-06-19T16:00:00Z"/>
         </w:rPr>
       </w:pPr>
     </w:p>
     <w:p>
       <w:pPr>
         <w:rPr>
-          <w:ins w:id="185" w:author="Kenneth Goldman" w:date="2025-06-19T16:01:00Z"/>
+          <w:ins w:id="188" w:author="Kenneth Goldman" w:date="2025-06-19T16:01:00Z"/>
         </w:rPr>
       </w:pPr>
-      <w:ins w:id="186" w:author="Kenneth Goldman" w:date="2025-06-19T15:57:00Z">
+      <w:ins w:id="189" w:author="Kenneth Goldman" w:date="2025-06-19T15:57:00Z">
         <w:r>
           <w:t xml:space="preserve">The </w:t>
         </w:r>
       </w:ins>
-      <w:ins w:id="187" w:author="Kenneth Goldman" w:date="2025-06-19T15:59:00Z">
+      <w:ins w:id="190" w:author="Kenneth Goldman" w:date="2025-06-19T15:59:00Z">
         <w:r>
           <w:t xml:space="preserve">OpenSSL packaged with Fedora </w:t>
         </w:r>
       </w:ins>
-      <w:ins w:id="188" w:author="Kenneth Goldman" w:date="2025-06-19T16:00:00Z">
-        <w:r>
-          <w:t>remo</w:t>
-        </w:r>
-        <w:r>
-          <w:t>ved SHA-1 support.</w:t>
-        </w:r>
-        <w:r>
-          <w:t xml:space="preserve"> The defau</w:t>
+      <w:ins w:id="191" w:author="Kenneth Goldman" w:date="2025-06-19T16:00:00Z">
+        <w:r>
+          <w:t>removed SHA-1 support. The defau</w:t>
         </w:r>
       </w:ins>
-      <w:ins w:id="189" w:author="Kenneth Goldman" w:date="2025-06-19T16:01:00Z">
+      <w:ins w:id="192" w:author="Kenneth Goldman" w:date="2025-06-19T16:01:00Z">
         <w:r>
           <w:t>l</w:t>
         </w:r>
       </w:ins>
-      <w:ins w:id="190" w:author="Kenneth Goldman" w:date="2025-06-19T16:00:00Z">
+      <w:ins w:id="193" w:author="Kenneth Goldman" w:date="2025-06-19T16:00:00Z">
         <w:r>
           <w:t>t regression test fails</w:t>
         </w:r>
       </w:ins>
-      <w:ins w:id="191" w:author="Kenneth Goldman" w:date="2025-06-19T16:01:00Z">
+      <w:ins w:id="194" w:author="Kenneth Goldman" w:date="2025-06-19T16:01:00Z">
         <w:r>
           <w:t>.  One possible error trace is:</w:t>
-        </w:r>
-      </w:ins>
-    </w:p>
-    <w:p>
-      <w:pPr>
-        <w:rPr>
-          <w:ins w:id="192" w:author="Kenneth Goldman" w:date="2025-06-19T16:01:00Z"/>
-        </w:rPr>
-      </w:pPr>
-    </w:p>
-    <w:p>
-      <w:pPr>
-        <w:rPr>
-          <w:ins w:id="193" w:author="Kenneth Goldman" w:date="2025-06-19T16:01:00Z"/>
-        </w:rPr>
-      </w:pPr>
-      <w:proofErr w:type="spellStart"/>
-      <w:ins w:id="194" w:author="Kenneth Goldman" w:date="2025-06-19T16:01:00Z">
-        <w:r>
-          <w:t>verifyRSASignatureFromRSA</w:t>
-        </w:r>
-        <w:proofErr w:type="spellEnd"/>
-        <w:r>
-          <w:t xml:space="preserve">: Error in </w:t>
-        </w:r>
-        <w:proofErr w:type="spellStart"/>
-        <w:r>
-          <w:t>EVP_PKEY_CTX_set_signature_</w:t>
-        </w:r>
-        <w:proofErr w:type="gramStart"/>
-        <w:r>
-          <w:t>md</w:t>
-        </w:r>
-        <w:proofErr w:type="spellEnd"/>
-        <w:r>
-          <w:t>(</w:t>
-        </w:r>
-        <w:proofErr w:type="gramEnd"/>
-        <w:r>
-          <w:t>)</w:t>
         </w:r>
       </w:ins>
     </w:p>
@@ -18805,20 +18750,60 @@
     <w:p>
       <w:pPr>
         <w:rPr>
-          <w:ins w:id="196" w:author="Kenneth Goldman" w:date="2025-06-19T16:00:00Z"/>
+          <w:ins w:id="196" w:author="Kenneth Goldman" w:date="2025-06-19T16:01:00Z"/>
         </w:rPr>
       </w:pPr>
+      <w:proofErr w:type="spellStart"/>
       <w:ins w:id="197" w:author="Kenneth Goldman" w:date="2025-06-19T16:01:00Z">
         <w:r>
+          <w:t>verifyRSASignatureFromRSA</w:t>
+        </w:r>
+        <w:proofErr w:type="spellEnd"/>
+        <w:r>
+          <w:t xml:space="preserve">: Error in </w:t>
+        </w:r>
+        <w:proofErr w:type="spellStart"/>
+        <w:r>
+          <w:t>EVP_PKEY_CTX_set_signature_</w:t>
+        </w:r>
+        <w:proofErr w:type="gramStart"/>
+        <w:r>
+          <w:t>md</w:t>
+        </w:r>
+        <w:proofErr w:type="spellEnd"/>
+        <w:r>
+          <w:t>(</w:t>
+        </w:r>
+        <w:proofErr w:type="gramEnd"/>
+        <w:r>
+          <w:t>)</w:t>
+        </w:r>
+      </w:ins>
+    </w:p>
+    <w:p>
+      <w:pPr>
+        <w:rPr>
+          <w:ins w:id="198" w:author="Kenneth Goldman" w:date="2025-06-19T16:01:00Z"/>
+        </w:rPr>
+      </w:pPr>
+    </w:p>
+    <w:p>
+      <w:pPr>
+        <w:rPr>
+          <w:ins w:id="199" w:author="Kenneth Goldman" w:date="2025-06-19T16:00:00Z"/>
+        </w:rPr>
+      </w:pPr>
+      <w:ins w:id="200" w:author="Kenneth Goldman" w:date="2025-06-19T16:01:00Z">
+        <w:r>
           <w:t>The solution is to set the env</w:t>
         </w:r>
       </w:ins>
-      <w:ins w:id="198" w:author="Kenneth Goldman" w:date="2025-06-19T16:02:00Z">
+      <w:ins w:id="201" w:author="Kenneth Goldman" w:date="2025-06-19T16:02:00Z">
         <w:r>
           <w:t xml:space="preserve">ironment variable </w:t>
         </w:r>
       </w:ins>
-      <w:ins w:id="199" w:author="Kenneth Goldman" w:date="2025-06-19T16:03:00Z">
+      <w:ins w:id="202" w:author="Kenneth Goldman" w:date="2025-06-19T16:03:00Z">
         <w:r>
           <w:fldChar w:fldCharType="begin"/>
         </w:r>
@@ -18829,7 +18814,7 @@
       <w:r>
         <w:fldChar w:fldCharType="separate"/>
       </w:r>
-      <w:ins w:id="200" w:author="Kenneth Goldman" w:date="2025-06-19T16:03:00Z">
+      <w:ins w:id="203" w:author="Kenneth Goldman" w:date="2025-06-19T16:03:00Z">
         <w:r>
           <w:t>TPM_TSS_NODEPRECATEDALGS</w:t>
         </w:r>
@@ -18844,7 +18829,7 @@
     <w:p>
       <w:pPr>
         <w:rPr>
-          <w:ins w:id="201" w:author="Kenneth Goldman" w:date="2025-06-19T15:56:00Z"/>
+          <w:ins w:id="204" w:author="Kenneth Goldman" w:date="2025-06-19T15:56:00Z"/>
         </w:rPr>
       </w:pPr>
     </w:p>
@@ -18965,206 +18950,44 @@
 <file path=word/numbering.xml><?xml version="1.0" encoding="utf-8"?>
 <w:numbering xmlns:wpc="http://schemas.microsoft.com/office/word/2010/wordprocessingCanvas" xmlns:cx="http://schemas.microsoft.com/office/drawing/2014/chartex" xmlns:cx1="http://schemas.microsoft.com/office/drawing/2015/9/8/chartex" xmlns:cx2="http://schemas.microsoft.com/office/drawing/2015/10/21/chartex" xmlns:cx3="http://schemas.microsoft.com/office/drawing/2016/5/9/chartex" xmlns:cx4="http://schemas.microsoft.com/office/drawing/2016/5/10/chartex" xmlns:cx5="http://schemas.microsoft.com/office/drawing/2016/5/11/chartex" xmlns:cx6="http://schemas.microsoft.com/office/drawing/2016/5/12/chartex" xmlns:cx7="http://schemas.microsoft.com/office/drawing/2016/5/13/chartex" xmlns:cx8="http://schemas.microsoft.com/office/drawing/2016/5/14/chartex" xmlns:mc="http://schemas.openxmlformats.org/markup-compatibility/2006" xmlns:aink="http://schemas.microsoft.com/office/drawing/2016/ink" xmlns:am3d="http://schemas.microsoft.com/office/drawing/2017/model3d" xmlns:o="urn:schemas-microsoft-com:office:office" xmlns:oel="http://schemas.microsoft.com/office/2019/extlst" xmlns:r="http://schemas.openxmlformats.org/officeDocument/2006/relationships" xmlns:m="http://schemas.openxmlformats.org/officeDocument/2006/math" xmlns:v="urn:schemas-microsoft-com:vml" xmlns:wp14="http://schemas.microsoft.com/office/word/2010/wordprocessingDrawing" xmlns:wp="http://schemas.openxmlformats.org/drawingml/2006/wordprocessingDrawing" xmlns:w10="urn:schemas-microsoft-com:office:word" xmlns:w="http://schemas.openxmlformats.org/wordprocessingml/2006/main" xmlns:w14="http://schemas.microsoft.com/office/word/2010/wordml" xmlns:w15="http://schemas.microsoft.com/office/word/2012/wordml" xmlns:w16cex="http://schemas.microsoft.com/office/word/2018/wordml/cex" xmlns:w16cid="http://schemas.microsoft.com/office/word/2016/wordml/cid" xmlns:w16="http://schemas.microsoft.com/office/word/2018/wordml" xmlns:w16du="http://schemas.microsoft.com/office/word/2023/wordml/word16du" xmlns:w16sdtdh="http://schemas.microsoft.com/office/word/2020/wordml/sdtdatahash" xmlns:w16sdtfl="http://schemas.microsoft.com/office/word/2024/wordml/sdtformatlock" xmlns:w16se="http://schemas.microsoft.com/office/word/2015/wordml/symex" xmlns:wpg="http://schemas.microsoft.com/office/word/2010/wordprocessingGroup" xmlns:wpi="http://schemas.microsoft.com/office/word/2010/wordprocessingInk" xmlns:wne="http://schemas.microsoft.com/office/word/2006/wordml" xmlns:wps="http://schemas.microsoft.com/office/word/2010/wordprocessingShape" mc:Ignorable="w14 w15 w16se w16cid w16 w16cex w16sdtdh w16sdtfl w16du wp14">
   <w:numPicBullet w:numPicBulletId="0">
-    <mc:AlternateContent>
-      <mc:Choice Requires="v">
-        <w:pict>
-          <v:shapetype w14:anchorId="55498EE3" id="_x0000_t75" coordsize="21600,21600" o:spt="75" o:preferrelative="t" path="m@4@5l@4@11@9@11@9@5xe" filled="f" stroked="f">
-            <v:stroke joinstyle="miter"/>
-            <v:formulas>
-              <v:f eqn="if lineDrawn pixelLineWidth 0"/>
-              <v:f eqn="sum @0 1 0"/>
-              <v:f eqn="sum 0 0 @1"/>
-              <v:f eqn="prod @2 1 2"/>
-              <v:f eqn="prod @3 21600 pixelWidth"/>
-              <v:f eqn="prod @3 21600 pixelHeight"/>
-              <v:f eqn="sum @0 0 1"/>
-              <v:f eqn="prod @6 1 2"/>
-              <v:f eqn="prod @7 21600 pixelWidth"/>
-              <v:f eqn="sum @8 21600 0"/>
-              <v:f eqn="prod @7 21600 pixelHeight"/>
-              <v:f eqn="sum @10 21600 0"/>
-            </v:formulas>
-            <v:path o:extrusionok="f" gradientshapeok="t" o:connecttype="rect"/>
-            <o:lock v:ext="edit" aspectratio="t"/>
-          </v:shapetype>
-          <v:shape id="Picture 1124978479" o:spid="_x0000_i1025" type="#_x0000_t75" style="width:9pt;height:9pt;visibility:visible;mso-wrap-style:square">
-            <v:imagedata r:id="rId1" o:title=""/>
-          </v:shape>
-        </w:pict>
-      </mc:Choice>
-      <mc:Fallback>
-        <w:drawing>
-          <wp:inline distT="0" distB="0" distL="0" distR="0" wp14:anchorId="0E8F8CFA" wp14:editId="34201535">
-            <wp:extent cx="114300" cy="114300"/>
-            <wp:effectExtent l="0" t="0" r="0" b="0"/>
-            <wp:docPr id="1124978479" name="Picture 1124978479"/>
-            <wp:cNvGraphicFramePr>
-              <a:graphicFrameLocks xmlns:a="http://schemas.openxmlformats.org/drawingml/2006/main" noChangeAspect="1"/>
-            </wp:cNvGraphicFramePr>
-            <a:graphic xmlns:a="http://schemas.openxmlformats.org/drawingml/2006/main">
-              <a:graphicData uri="http://schemas.openxmlformats.org/drawingml/2006/picture">
-                <pic:pic xmlns:pic="http://schemas.openxmlformats.org/drawingml/2006/picture">
-                  <pic:nvPicPr>
-                    <pic:cNvPr id="0" name="Picture -1023"/>
-                    <pic:cNvPicPr>
-                      <a:picLocks noChangeAspect="1" noChangeArrowheads="1"/>
-                    </pic:cNvPicPr>
-                  </pic:nvPicPr>
-                  <pic:blipFill>
-                    <a:blip r:embed="rId2">
-                      <a:extLst>
-                        <a:ext uri="{28A0092B-C50C-407E-A947-70E740481C1C}">
-                          <a14:useLocalDpi xmlns:a14="http://schemas.microsoft.com/office/drawing/2010/main" val="0"/>
-                        </a:ext>
-                      </a:extLst>
-                    </a:blip>
-                    <a:srcRect/>
-                    <a:stretch>
-                      <a:fillRect/>
-                    </a:stretch>
-                  </pic:blipFill>
-                  <pic:spPr bwMode="auto">
-                    <a:xfrm>
-                      <a:off x="0" y="0"/>
-                      <a:ext cx="114300" cy="114300"/>
-                    </a:xfrm>
-                    <a:prstGeom prst="rect">
-                      <a:avLst/>
-                    </a:prstGeom>
-                    <a:noFill/>
-                    <a:ln>
-                      <a:noFill/>
-                    </a:ln>
-                  </pic:spPr>
-                </pic:pic>
-              </a:graphicData>
-            </a:graphic>
-          </wp:inline>
-        </w:drawing>
-      </mc:Fallback>
-    </mc:AlternateContent>
+    <w:pict>
+      <v:shapetype id="_x0000_t75" coordsize="21600,21600" o:spt="75" o:preferrelative="t" path="m@4@5l@4@11@9@11@9@5xe" filled="f" stroked="f">
+        <v:stroke joinstyle="miter"/>
+        <v:formulas>
+          <v:f eqn="if lineDrawn pixelLineWidth 0"/>
+          <v:f eqn="sum @0 1 0"/>
+          <v:f eqn="sum 0 0 @1"/>
+          <v:f eqn="prod @2 1 2"/>
+          <v:f eqn="prod @3 21600 pixelWidth"/>
+          <v:f eqn="prod @3 21600 pixelHeight"/>
+          <v:f eqn="sum @0 0 1"/>
+          <v:f eqn="prod @6 1 2"/>
+          <v:f eqn="prod @7 21600 pixelWidth"/>
+          <v:f eqn="sum @8 21600 0"/>
+          <v:f eqn="prod @7 21600 pixelHeight"/>
+          <v:f eqn="sum @10 21600 0"/>
+        </v:formulas>
+        <v:path o:extrusionok="f" gradientshapeok="t" o:connecttype="rect"/>
+        <o:lock v:ext="edit" aspectratio="t"/>
+      </v:shapetype>
+      <v:shape id="_x0000_i1029" type="#_x0000_t75" style="width:9pt;height:9pt;visibility:visible;mso-wrap-style:square" o:bullet="t">
+        <v:imagedata r:id="rId1" o:title=""/>
+      </v:shape>
+    </w:pict>
   </w:numPicBullet>
   <w:numPicBullet w:numPicBulletId="1">
-    <mc:AlternateContent>
-      <mc:Choice Requires="v">
-        <w:pict>
-          <v:shape w14:anchorId="373DB456" id="Picture 1804995422" o:spid="_x0000_i1025" type="#_x0000_t75" style="width:11.4pt;height:11.4pt;visibility:visible;mso-wrap-style:square">
-            <v:imagedata r:id="rId3" o:title=""/>
-          </v:shape>
-        </w:pict>
-      </mc:Choice>
-      <mc:Fallback>
-        <w:drawing>
-          <wp:inline distT="0" distB="0" distL="0" distR="0" wp14:anchorId="4DDA698B" wp14:editId="4F0FEAC9">
-            <wp:extent cx="144780" cy="144780"/>
-            <wp:effectExtent l="0" t="0" r="0" b="0"/>
-            <wp:docPr id="1804995422" name="Picture 1804995422"/>
-            <wp:cNvGraphicFramePr>
-              <a:graphicFrameLocks xmlns:a="http://schemas.openxmlformats.org/drawingml/2006/main" noChangeAspect="1"/>
-            </wp:cNvGraphicFramePr>
-            <a:graphic xmlns:a="http://schemas.openxmlformats.org/drawingml/2006/main">
-              <a:graphicData uri="http://schemas.openxmlformats.org/drawingml/2006/picture">
-                <pic:pic xmlns:pic="http://schemas.openxmlformats.org/drawingml/2006/picture">
-                  <pic:nvPicPr>
-                    <pic:cNvPr id="0" name="Picture -1022"/>
-                    <pic:cNvPicPr>
-                      <a:picLocks noChangeAspect="1" noChangeArrowheads="1"/>
-                    </pic:cNvPicPr>
-                  </pic:nvPicPr>
-                  <pic:blipFill>
-                    <a:blip r:embed="rId4">
-                      <a:extLst>
-                        <a:ext uri="{28A0092B-C50C-407E-A947-70E740481C1C}">
-                          <a14:useLocalDpi xmlns:a14="http://schemas.microsoft.com/office/drawing/2010/main" val="0"/>
-                        </a:ext>
-                      </a:extLst>
-                    </a:blip>
-                    <a:srcRect/>
-                    <a:stretch>
-                      <a:fillRect/>
-                    </a:stretch>
-                  </pic:blipFill>
-                  <pic:spPr bwMode="auto">
-                    <a:xfrm>
-                      <a:off x="0" y="0"/>
-                      <a:ext cx="144780" cy="144780"/>
-                    </a:xfrm>
-                    <a:prstGeom prst="rect">
-                      <a:avLst/>
-                    </a:prstGeom>
-                    <a:noFill/>
-                    <a:ln>
-                      <a:noFill/>
-                    </a:ln>
-                  </pic:spPr>
-                </pic:pic>
-              </a:graphicData>
-            </a:graphic>
-          </wp:inline>
-        </w:drawing>
-      </mc:Fallback>
-    </mc:AlternateContent>
+    <w:pict>
+      <v:shape id="_x0000_i1030" type="#_x0000_t75" style="width:11.4pt;height:11.4pt;visibility:visible;mso-wrap-style:square" o:bullet="t">
+        <v:imagedata r:id="rId2" o:title=""/>
+      </v:shape>
+    </w:pict>
   </w:numPicBullet>
   <w:numPicBullet w:numPicBulletId="2">
-    <mc:AlternateContent>
-      <mc:Choice Requires="v">
-        <w:pict>
-          <v:shape w14:anchorId="6E87F905" id="Picture 837607938" o:spid="_x0000_i1025" type="#_x0000_t75" style="width:8.4pt;height:8.4pt;visibility:visible;mso-wrap-style:square">
-            <v:imagedata r:id="rId5" o:title=""/>
-          </v:shape>
-        </w:pict>
-      </mc:Choice>
-      <mc:Fallback>
-        <w:drawing>
-          <wp:inline distT="0" distB="0" distL="0" distR="0" wp14:anchorId="30AF1370" wp14:editId="4789712D">
-            <wp:extent cx="106680" cy="106680"/>
-            <wp:effectExtent l="0" t="0" r="0" b="0"/>
-            <wp:docPr id="837607938" name="Picture 837607938"/>
-            <wp:cNvGraphicFramePr>
-              <a:graphicFrameLocks xmlns:a="http://schemas.openxmlformats.org/drawingml/2006/main" noChangeAspect="1"/>
-            </wp:cNvGraphicFramePr>
-            <a:graphic xmlns:a="http://schemas.openxmlformats.org/drawingml/2006/main">
-              <a:graphicData uri="http://schemas.openxmlformats.org/drawingml/2006/picture">
-                <pic:pic xmlns:pic="http://schemas.openxmlformats.org/drawingml/2006/picture">
-                  <pic:nvPicPr>
-                    <pic:cNvPr id="0" name="Picture -1021"/>
-                    <pic:cNvPicPr>
-                      <a:picLocks noChangeAspect="1" noChangeArrowheads="1"/>
-                    </pic:cNvPicPr>
-                  </pic:nvPicPr>
-                  <pic:blipFill>
-                    <a:blip r:embed="rId6">
-                      <a:extLst>
-                        <a:ext uri="{28A0092B-C50C-407E-A947-70E740481C1C}">
-                          <a14:useLocalDpi xmlns:a14="http://schemas.microsoft.com/office/drawing/2010/main" val="0"/>
-                        </a:ext>
-                      </a:extLst>
-                    </a:blip>
-                    <a:srcRect/>
-                    <a:stretch>
-                      <a:fillRect/>
-                    </a:stretch>
-                  </pic:blipFill>
-                  <pic:spPr bwMode="auto">
-                    <a:xfrm>
-                      <a:off x="0" y="0"/>
-                      <a:ext cx="106680" cy="106680"/>
-                    </a:xfrm>
-                    <a:prstGeom prst="rect">
-                      <a:avLst/>
-                    </a:prstGeom>
-                    <a:noFill/>
-                    <a:ln>
-                      <a:noFill/>
-                    </a:ln>
-                  </pic:spPr>
-                </pic:pic>
-              </a:graphicData>
-            </a:graphic>
-          </wp:inline>
-        </w:drawing>
-      </mc:Fallback>
-    </mc:AlternateContent>
+    <w:pict>
+      <v:shape id="_x0000_i1031" type="#_x0000_t75" style="width:8.4pt;height:8.4pt;visibility:visible;mso-wrap-style:square" o:bullet="t">
+        <v:imagedata r:id="rId3" o:title=""/>
+      </v:shape>
+    </w:pict>
   </w:numPicBullet>
   <w:abstractNum w:abstractNumId="0" w15:restartNumberingAfterBreak="0">
     <w:nsid w:val="0BE469ED"/>

</xml_diff>